<commit_message>
fix: improve wording and clarity in multiple translations
</commit_message>
<xml_diff>
--- a/data/poems/poems_english/poezija i proza na engleskom/A Love Letter to the Town That Isn't Calling Back.docx
+++ b/data/poems/poems_english/poezija i proza na engleskom/A Love Letter to the Town That Isn't Calling Back.docx
@@ -1,6 +1,6 @@
 
 <file path=word/document.xml><?xml version="1.0" encoding="utf-8"?>
-<w:document xmlns:wpc="http://schemas.microsoft.com/office/word/2010/wordprocessingCanvas" xmlns:cx="http://schemas.microsoft.com/office/drawing/2014/chartex" xmlns:cx1="http://schemas.microsoft.com/office/drawing/2015/9/8/chartex" xmlns:cx2="http://schemas.microsoft.com/office/drawing/2015/10/21/chartex" xmlns:cx3="http://schemas.microsoft.com/office/drawing/2016/5/9/chartex" xmlns:cx4="http://schemas.microsoft.com/office/drawing/2016/5/10/chartex" xmlns:cx5="http://schemas.microsoft.com/office/drawing/2016/5/11/chartex" xmlns:cx6="http://schemas.microsoft.com/office/drawing/2016/5/12/chartex" xmlns:cx7="http://schemas.microsoft.com/office/drawing/2016/5/13/chartex" xmlns:cx8="http://schemas.microsoft.com/office/drawing/2016/5/14/chartex" xmlns:mc="http://schemas.openxmlformats.org/markup-compatibility/2006" xmlns:aink="http://schemas.microsoft.com/office/drawing/2016/ink" xmlns:am3d="http://schemas.microsoft.com/office/drawing/2017/model3d" xmlns:o="urn:schemas-microsoft-com:office:office" xmlns:oel="http://schemas.microsoft.com/office/2019/extlst" xmlns:r="http://schemas.openxmlformats.org/officeDocument/2006/relationships" xmlns:m="http://schemas.openxmlformats.org/officeDocument/2006/math" xmlns:v="urn:schemas-microsoft-com:vml" xmlns:wp14="http://schemas.microsoft.com/office/word/2010/wordprocessingDrawing" xmlns:wp="http://schemas.openxmlformats.org/drawingml/2006/wordprocessingDrawing" xmlns:w10="urn:schemas-microsoft-com:office:word" xmlns:w="http://schemas.openxmlformats.org/wordprocessingml/2006/main" xmlns:w14="http://schemas.microsoft.com/office/word/2010/wordml" xmlns:w15="http://schemas.microsoft.com/office/word/2012/wordml" xmlns:w16cex="http://schemas.microsoft.com/office/word/2018/wordml/cex" xmlns:w16cid="http://schemas.microsoft.com/office/word/2016/wordml/cid" xmlns:w16="http://schemas.microsoft.com/office/word/2018/wordml" xmlns:w16du="http://schemas.microsoft.com/office/word/2023/wordml/word16du" xmlns:w16sdtdh="http://schemas.microsoft.com/office/word/2020/wordml/sdtdatahash" xmlns:w16se="http://schemas.microsoft.com/office/word/2015/wordml/symex" xmlns:wpg="http://schemas.microsoft.com/office/word/2010/wordprocessingGroup" xmlns:wpi="http://schemas.microsoft.com/office/word/2010/wordprocessingInk" xmlns:wne="http://schemas.microsoft.com/office/word/2006/wordml" xmlns:wps="http://schemas.microsoft.com/office/word/2010/wordprocessingShape" mc:Ignorable="w14 w15 w16se w16cid w16 w16cex w16sdtdh w16du wp14">
+<w:document xmlns:wpc="http://schemas.microsoft.com/office/word/2010/wordprocessingCanvas" xmlns:cx="http://schemas.microsoft.com/office/drawing/2014/chartex" xmlns:cx1="http://schemas.microsoft.com/office/drawing/2015/9/8/chartex" xmlns:cx2="http://schemas.microsoft.com/office/drawing/2015/10/21/chartex" xmlns:cx3="http://schemas.microsoft.com/office/drawing/2016/5/9/chartex" xmlns:cx4="http://schemas.microsoft.com/office/drawing/2016/5/10/chartex" xmlns:cx5="http://schemas.microsoft.com/office/drawing/2016/5/11/chartex" xmlns:cx6="http://schemas.microsoft.com/office/drawing/2016/5/12/chartex" xmlns:cx7="http://schemas.microsoft.com/office/drawing/2016/5/13/chartex" xmlns:cx8="http://schemas.microsoft.com/office/drawing/2016/5/14/chartex" xmlns:mc="http://schemas.openxmlformats.org/markup-compatibility/2006" xmlns:aink="http://schemas.microsoft.com/office/drawing/2016/ink" xmlns:am3d="http://schemas.microsoft.com/office/drawing/2017/model3d" xmlns:o="urn:schemas-microsoft-com:office:office" xmlns:oel="http://schemas.microsoft.com/office/2019/extlst" xmlns:r="http://schemas.openxmlformats.org/officeDocument/2006/relationships" xmlns:m="http://schemas.openxmlformats.org/officeDocument/2006/math" xmlns:v="urn:schemas-microsoft-com:vml" xmlns:wp14="http://schemas.microsoft.com/office/word/2010/wordprocessingDrawing" xmlns:wp="http://schemas.openxmlformats.org/drawingml/2006/wordprocessingDrawing" xmlns:w10="urn:schemas-microsoft-com:office:word" xmlns:w="http://schemas.openxmlformats.org/wordprocessingml/2006/main" xmlns:w14="http://schemas.microsoft.com/office/word/2010/wordml" xmlns:w15="http://schemas.microsoft.com/office/word/2012/wordml" xmlns:w16cex="http://schemas.microsoft.com/office/word/2018/wordml/cex" xmlns:w16cid="http://schemas.microsoft.com/office/word/2016/wordml/cid" xmlns:w16="http://schemas.microsoft.com/office/word/2018/wordml" xmlns:w16du="http://schemas.microsoft.com/office/word/2023/wordml/word16du" xmlns:w16sdtdh="http://schemas.microsoft.com/office/word/2020/wordml/sdtdatahash" xmlns:w16sdtfl="http://schemas.microsoft.com/office/word/2024/wordml/sdtformatlock" xmlns:w16se="http://schemas.microsoft.com/office/word/2015/wordml/symex" xmlns:wpg="http://schemas.microsoft.com/office/word/2010/wordprocessingGroup" xmlns:wpi="http://schemas.microsoft.com/office/word/2010/wordprocessingInk" xmlns:wne="http://schemas.microsoft.com/office/word/2006/wordml" xmlns:wps="http://schemas.microsoft.com/office/word/2010/wordprocessingShape" mc:Ignorable="w14 w15 w16se w16cid w16 w16cex w16sdtdh w16sdtfl w16du wp14">
   <w:body>
     <w:p>
       <w:pPr>
@@ -373,7 +373,6 @@
         </w:rPr>
         <w:t xml:space="preserve">the </w:t>
       </w:r>
-      <w:proofErr w:type="spellStart"/>
       <w:r>
         <w:rPr>
           <w:sz w:val="24"/>
@@ -382,7 +381,6 @@
         </w:rPr>
         <w:t>ojkanje</w:t>
       </w:r>
-      <w:proofErr w:type="spellEnd"/>
       <w:r>
         <w:rPr>
           <w:sz w:val="24"/>
@@ -864,7 +862,14 @@
           <w:szCs w:val="24"/>
           <w:lang w:val="en-US"/>
         </w:rPr>
-        <w:t>pull the handle on a slot machine</w:t>
+        <w:t xml:space="preserve">pull the handle </w:t>
+      </w:r>
+      <w:r>
+        <w:rPr>
+          <w:sz w:val="24"/>
+          <w:szCs w:val="24"/>
+        </w:rPr>
+        <w:t>the fruit machines</w:t>
       </w:r>
     </w:p>
     <w:p>
@@ -1000,9 +1005,8 @@
         <w:rPr>
           <w:sz w:val="24"/>
           <w:szCs w:val="24"/>
-          <w:lang w:val="en-US"/>
-        </w:rPr>
-        <w:t>desire</w:t>
+        </w:rPr>
+        <w:t>yearning</w:t>
       </w:r>
     </w:p>
     <w:p>
@@ -1170,25 +1174,50 @@
           <w:szCs w:val="24"/>
           <w:lang w:val="en-US"/>
         </w:rPr>
-        <w:t xml:space="preserve">with a bottle of </w:t>
-      </w:r>
-      <w:proofErr w:type="spellStart"/>
-      <w:r>
-        <w:rPr>
-          <w:sz w:val="24"/>
-          <w:szCs w:val="24"/>
-          <w:lang w:val="en-US"/>
-        </w:rPr>
-        <w:t>Nektar</w:t>
-      </w:r>
-      <w:proofErr w:type="spellEnd"/>
-      <w:r>
-        <w:rPr>
-          <w:sz w:val="24"/>
-          <w:szCs w:val="24"/>
-          <w:lang w:val="en-US"/>
-        </w:rPr>
-        <w:t xml:space="preserve"> in the park</w:t>
+        <w:t xml:space="preserve">with </w:t>
+      </w:r>
+      <w:r>
+        <w:rPr>
+          <w:sz w:val="24"/>
+          <w:szCs w:val="24"/>
+        </w:rPr>
+        <w:t>two</w:t>
+      </w:r>
+      <w:r>
+        <w:rPr>
+          <w:sz w:val="24"/>
+          <w:szCs w:val="24"/>
+        </w:rPr>
+        <w:t xml:space="preserve">-liter of </w:t>
+      </w:r>
+      <w:r>
+        <w:rPr>
+          <w:sz w:val="24"/>
+          <w:szCs w:val="24"/>
+        </w:rPr>
+        <w:t xml:space="preserve">Nektar </w:t>
+      </w:r>
+      <w:r>
+        <w:rPr>
+          <w:sz w:val="24"/>
+          <w:szCs w:val="24"/>
+        </w:rPr>
+        <w:t>beer</w:t>
+      </w:r>
+      <w:r>
+        <w:rPr>
+          <w:sz w:val="24"/>
+          <w:szCs w:val="24"/>
+        </w:rPr>
+        <w:t xml:space="preserve"> </w:t>
+      </w:r>
+      <w:r>
+        <w:rPr>
+          <w:sz w:val="24"/>
+          <w:szCs w:val="24"/>
+          <w:lang w:val="en-US"/>
+        </w:rPr>
+        <w:t>in the park</w:t>
       </w:r>
     </w:p>
     <w:p>
@@ -1354,18 +1383,8 @@
           <w:szCs w:val="24"/>
           <w:lang w:val="en-US"/>
         </w:rPr>
-        <w:t xml:space="preserve">I am yours </w:t>
-      </w:r>
-      <w:proofErr w:type="spellStart"/>
-      <w:r>
-        <w:rPr>
-          <w:sz w:val="24"/>
-          <w:szCs w:val="24"/>
-          <w:lang w:val="en-US"/>
-        </w:rPr>
-        <w:t>yours</w:t>
-      </w:r>
-      <w:proofErr w:type="spellEnd"/>
+        <w:t>I am yours yours</w:t>
+      </w:r>
     </w:p>
     <w:p>
       <w:pPr>
@@ -1440,19 +1459,43 @@
           <w:szCs w:val="24"/>
           <w:lang w:val="en-US"/>
         </w:rPr>
-        <w:t>scarfs around their necks</w:t>
-      </w:r>
-    </w:p>
-    <w:p>
-      <w:pPr>
-        <w:spacing w:line="240" w:lineRule="auto"/>
-        <w:contextualSpacing/>
-        <w:rPr>
-          <w:sz w:val="24"/>
-          <w:szCs w:val="24"/>
-          <w:lang w:val="en-US"/>
-        </w:rPr>
-      </w:pPr>
+        <w:t>scar</w:t>
+      </w:r>
+      <w:r>
+        <w:rPr>
+          <w:sz w:val="24"/>
+          <w:szCs w:val="24"/>
+          <w:lang w:val="en-US"/>
+        </w:rPr>
+        <w:t>ves</w:t>
+      </w:r>
+      <w:r>
+        <w:rPr>
+          <w:sz w:val="24"/>
+          <w:szCs w:val="24"/>
+          <w:lang w:val="en-US"/>
+        </w:rPr>
+        <w:t xml:space="preserve"> around their necks</w:t>
+      </w:r>
+    </w:p>
+    <w:p>
+      <w:pPr>
+        <w:spacing w:line="240" w:lineRule="auto"/>
+        <w:contextualSpacing/>
+        <w:rPr>
+          <w:sz w:val="24"/>
+          <w:szCs w:val="24"/>
+          <w:lang w:val="en-US"/>
+        </w:rPr>
+      </w:pPr>
+      <w:r>
+        <w:rPr>
+          <w:sz w:val="24"/>
+          <w:szCs w:val="24"/>
+          <w:lang w:val="en-US"/>
+        </w:rPr>
+        <w:t xml:space="preserve">an </w:t>
+      </w:r>
       <w:r>
         <w:rPr>
           <w:sz w:val="24"/>
@@ -1731,18 +1774,116 @@
           <w:szCs w:val="24"/>
           <w:lang w:val="en-US"/>
         </w:rPr>
-        <w:t xml:space="preserve">whore </w:t>
-      </w:r>
-      <w:proofErr w:type="spellStart"/>
-      <w:r>
-        <w:rPr>
-          <w:sz w:val="24"/>
-          <w:szCs w:val="24"/>
-          <w:lang w:val="en-US"/>
-        </w:rPr>
-        <w:t>whore</w:t>
-      </w:r>
-      <w:proofErr w:type="spellEnd"/>
+        <w:t>whore whore whore</w:t>
+      </w:r>
+    </w:p>
+    <w:p>
+      <w:pPr>
+        <w:spacing w:line="240" w:lineRule="auto"/>
+        <w:contextualSpacing/>
+        <w:rPr>
+          <w:sz w:val="24"/>
+          <w:szCs w:val="24"/>
+          <w:lang w:val="en-US"/>
+        </w:rPr>
+      </w:pPr>
+      <w:r>
+        <w:rPr>
+          <w:sz w:val="24"/>
+          <w:szCs w:val="24"/>
+          <w:lang w:val="en-US"/>
+        </w:rPr>
+        <w:t xml:space="preserve">not one adjective </w:t>
+      </w:r>
+      <w:r>
+        <w:rPr>
+          <w:sz w:val="24"/>
+          <w:szCs w:val="24"/>
+          <w:lang w:val="en-US"/>
+        </w:rPr>
+        <w:t>preceding the noun</w:t>
+      </w:r>
+    </w:p>
+    <w:p>
+      <w:pPr>
+        <w:spacing w:line="240" w:lineRule="auto"/>
+        <w:contextualSpacing/>
+        <w:rPr>
+          <w:sz w:val="24"/>
+          <w:szCs w:val="24"/>
+          <w:lang w:val="en-US"/>
+        </w:rPr>
+      </w:pPr>
+      <w:r>
+        <w:rPr>
+          <w:sz w:val="24"/>
+          <w:szCs w:val="24"/>
+          <w:lang w:val="en-US"/>
+        </w:rPr>
+        <w:t>my town</w:t>
+      </w:r>
+    </w:p>
+    <w:p>
+      <w:pPr>
+        <w:spacing w:line="240" w:lineRule="auto"/>
+        <w:contextualSpacing/>
+        <w:rPr>
+          <w:sz w:val="24"/>
+          <w:szCs w:val="24"/>
+          <w:lang w:val="en-US"/>
+        </w:rPr>
+      </w:pPr>
+      <w:r>
+        <w:rPr>
+          <w:sz w:val="24"/>
+          <w:szCs w:val="24"/>
+          <w:lang w:val="en-US"/>
+        </w:rPr>
+        <w:t xml:space="preserve">you </w:t>
+      </w:r>
+      <w:r>
+        <w:rPr>
+          <w:sz w:val="24"/>
+          <w:szCs w:val="24"/>
+          <w:lang w:val="en-US"/>
+        </w:rPr>
+        <w:t>limp</w:t>
+      </w:r>
+      <w:r>
+        <w:rPr>
+          <w:sz w:val="24"/>
+          <w:szCs w:val="24"/>
+          <w:lang w:val="en-US"/>
+        </w:rPr>
+        <w:t xml:space="preserve"> dick</w:t>
+      </w:r>
+    </w:p>
+    <w:p>
+      <w:pPr>
+        <w:spacing w:line="240" w:lineRule="auto"/>
+        <w:contextualSpacing/>
+        <w:rPr>
+          <w:sz w:val="24"/>
+          <w:szCs w:val="24"/>
+          <w:lang w:val="en-US"/>
+        </w:rPr>
+      </w:pPr>
+      <w:r>
+        <w:rPr>
+          <w:sz w:val="24"/>
+          <w:szCs w:val="24"/>
+          <w:lang w:val="en-US"/>
+        </w:rPr>
+        <w:t>you frustrate me</w:t>
+      </w:r>
+      <w:r>
+        <w:rPr>
+          <w:sz w:val="24"/>
+          <w:szCs w:val="24"/>
+          <w:lang w:val="en-US"/>
+        </w:rPr>
+        <w:t xml:space="preserve"> you</w:t>
+      </w:r>
       <w:r>
         <w:rPr>
           <w:sz w:val="24"/>
@@ -1751,61 +1892,554 @@
         </w:rPr>
         <w:t xml:space="preserve"> </w:t>
       </w:r>
-      <w:proofErr w:type="spellStart"/>
-      <w:r>
-        <w:rPr>
-          <w:sz w:val="24"/>
-          <w:szCs w:val="24"/>
-          <w:lang w:val="en-US"/>
-        </w:rPr>
-        <w:t>whore</w:t>
-      </w:r>
-      <w:proofErr w:type="spellEnd"/>
-    </w:p>
-    <w:p>
-      <w:pPr>
-        <w:spacing w:line="240" w:lineRule="auto"/>
-        <w:contextualSpacing/>
-        <w:rPr>
-          <w:sz w:val="24"/>
-          <w:szCs w:val="24"/>
-          <w:lang w:val="en-US"/>
-        </w:rPr>
-      </w:pPr>
-      <w:r>
-        <w:rPr>
-          <w:sz w:val="24"/>
-          <w:szCs w:val="24"/>
-          <w:lang w:val="en-US"/>
-        </w:rPr>
-        <w:t xml:space="preserve">not one adjective </w:t>
-      </w:r>
-      <w:r>
-        <w:rPr>
-          <w:sz w:val="24"/>
-          <w:szCs w:val="24"/>
-          <w:lang w:val="en-US"/>
-        </w:rPr>
-        <w:t>preceding the noun</w:t>
-      </w:r>
-    </w:p>
-    <w:p>
-      <w:pPr>
-        <w:spacing w:line="240" w:lineRule="auto"/>
-        <w:contextualSpacing/>
-        <w:rPr>
-          <w:sz w:val="24"/>
-          <w:szCs w:val="24"/>
-          <w:lang w:val="en-US"/>
-        </w:rPr>
-      </w:pPr>
-      <w:r>
-        <w:rPr>
-          <w:sz w:val="24"/>
-          <w:szCs w:val="24"/>
-          <w:lang w:val="en-US"/>
-        </w:rPr>
-        <w:t>my town</w:t>
+      <w:r>
+        <w:rPr>
+          <w:sz w:val="24"/>
+          <w:szCs w:val="24"/>
+          <w:lang w:val="en-US"/>
+        </w:rPr>
+        <w:t>drive me crazy</w:t>
+      </w:r>
+    </w:p>
+    <w:p>
+      <w:pPr>
+        <w:spacing w:line="240" w:lineRule="auto"/>
+        <w:contextualSpacing/>
+        <w:rPr>
+          <w:sz w:val="24"/>
+          <w:szCs w:val="24"/>
+          <w:lang w:val="en-US"/>
+        </w:rPr>
+      </w:pPr>
+      <w:r>
+        <w:rPr>
+          <w:sz w:val="24"/>
+          <w:szCs w:val="24"/>
+          <w:lang w:val="en-US"/>
+        </w:rPr>
+        <w:t>I want to give you everything</w:t>
+      </w:r>
+    </w:p>
+    <w:p>
+      <w:pPr>
+        <w:spacing w:line="240" w:lineRule="auto"/>
+        <w:contextualSpacing/>
+        <w:rPr>
+          <w:sz w:val="24"/>
+          <w:szCs w:val="24"/>
+          <w:lang w:val="en-US"/>
+        </w:rPr>
+      </w:pPr>
+      <w:r>
+        <w:rPr>
+          <w:sz w:val="24"/>
+          <w:szCs w:val="24"/>
+          <w:lang w:val="en-US"/>
+        </w:rPr>
+        <w:t>and you</w:t>
+      </w:r>
+      <w:r>
+        <w:rPr>
+          <w:sz w:val="24"/>
+          <w:szCs w:val="24"/>
+          <w:lang w:val="en-US"/>
+        </w:rPr>
+        <w:t>’re just sitting there</w:t>
+      </w:r>
+    </w:p>
+    <w:p>
+      <w:pPr>
+        <w:spacing w:line="240" w:lineRule="auto"/>
+        <w:contextualSpacing/>
+        <w:rPr>
+          <w:sz w:val="24"/>
+          <w:szCs w:val="24"/>
+          <w:lang w:val="en-US"/>
+        </w:rPr>
+      </w:pPr>
+      <w:r>
+        <w:rPr>
+          <w:sz w:val="24"/>
+          <w:szCs w:val="24"/>
+          <w:lang w:val="en-US"/>
+        </w:rPr>
+        <w:t>counting sheep</w:t>
+      </w:r>
+    </w:p>
+    <w:p>
+      <w:pPr>
+        <w:spacing w:line="240" w:lineRule="auto"/>
+        <w:contextualSpacing/>
+        <w:rPr>
+          <w:sz w:val="24"/>
+          <w:szCs w:val="24"/>
+          <w:lang w:val="en-US"/>
+        </w:rPr>
+      </w:pPr>
+      <w:r>
+        <w:rPr>
+          <w:sz w:val="24"/>
+          <w:szCs w:val="24"/>
+          <w:lang w:val="en-US"/>
+        </w:rPr>
+        <w:t>developing paraplegia</w:t>
+      </w:r>
+    </w:p>
+    <w:p>
+      <w:pPr>
+        <w:spacing w:line="240" w:lineRule="auto"/>
+        <w:contextualSpacing/>
+        <w:rPr>
+          <w:sz w:val="24"/>
+          <w:szCs w:val="24"/>
+          <w:lang w:val="en-US"/>
+        </w:rPr>
+      </w:pPr>
+      <w:r>
+        <w:rPr>
+          <w:sz w:val="24"/>
+          <w:szCs w:val="24"/>
+          <w:lang w:val="en-US"/>
+        </w:rPr>
+        <w:t>what am I to you</w:t>
+      </w:r>
+    </w:p>
+    <w:p>
+      <w:pPr>
+        <w:spacing w:line="240" w:lineRule="auto"/>
+        <w:contextualSpacing/>
+        <w:rPr>
+          <w:sz w:val="24"/>
+          <w:szCs w:val="24"/>
+          <w:lang w:val="en-US"/>
+        </w:rPr>
+      </w:pPr>
+      <w:r>
+        <w:rPr>
+          <w:sz w:val="24"/>
+          <w:szCs w:val="24"/>
+          <w:lang w:val="en-US"/>
+        </w:rPr>
+        <w:t xml:space="preserve">some </w:t>
+      </w:r>
+      <w:r>
+        <w:rPr>
+          <w:sz w:val="24"/>
+          <w:szCs w:val="24"/>
+          <w:lang w:val="en-US"/>
+        </w:rPr>
+        <w:t>diploma</w:t>
+      </w:r>
+      <w:r>
+        <w:rPr>
+          <w:sz w:val="24"/>
+          <w:szCs w:val="24"/>
+          <w:lang w:val="en-US"/>
+        </w:rPr>
+        <w:t xml:space="preserve"> to </w:t>
+      </w:r>
+      <w:r>
+        <w:rPr>
+          <w:sz w:val="24"/>
+          <w:szCs w:val="24"/>
+          <w:lang w:val="en-US"/>
+        </w:rPr>
+        <w:t>put o</w:t>
+      </w:r>
+      <w:r>
+        <w:rPr>
+          <w:sz w:val="24"/>
+          <w:szCs w:val="24"/>
+          <w:lang w:val="en-US"/>
+        </w:rPr>
+        <w:t>ut for the guests</w:t>
+      </w:r>
+    </w:p>
+    <w:p>
+      <w:pPr>
+        <w:spacing w:line="240" w:lineRule="auto"/>
+        <w:contextualSpacing/>
+        <w:rPr>
+          <w:sz w:val="24"/>
+          <w:szCs w:val="24"/>
+          <w:lang w:val="en-US"/>
+        </w:rPr>
+      </w:pPr>
+      <w:r>
+        <w:rPr>
+          <w:sz w:val="24"/>
+          <w:szCs w:val="24"/>
+          <w:lang w:val="en-US"/>
+        </w:rPr>
+        <w:t xml:space="preserve">a souvenir a </w:t>
+      </w:r>
+      <w:r>
+        <w:rPr>
+          <w:sz w:val="24"/>
+          <w:szCs w:val="24"/>
+          <w:lang w:val="en-US"/>
+        </w:rPr>
+        <w:t>sea</w:t>
+      </w:r>
+      <w:r>
+        <w:rPr>
+          <w:sz w:val="24"/>
+          <w:szCs w:val="24"/>
+          <w:lang w:val="en-US"/>
+        </w:rPr>
+        <w:t>shell from Sutomore</w:t>
+      </w:r>
+    </w:p>
+    <w:p>
+      <w:pPr>
+        <w:spacing w:line="240" w:lineRule="auto"/>
+        <w:contextualSpacing/>
+        <w:rPr>
+          <w:sz w:val="24"/>
+          <w:szCs w:val="24"/>
+          <w:lang w:val="en-US"/>
+        </w:rPr>
+      </w:pPr>
+      <w:r>
+        <w:rPr>
+          <w:sz w:val="24"/>
+          <w:szCs w:val="24"/>
+          <w:lang w:val="en-US"/>
+        </w:rPr>
+        <w:t xml:space="preserve">that </w:t>
+      </w:r>
+      <w:r>
+        <w:rPr>
+          <w:sz w:val="24"/>
+          <w:szCs w:val="24"/>
+          <w:lang w:val="en-US"/>
+        </w:rPr>
+        <w:t>every couple of years</w:t>
+      </w:r>
+    </w:p>
+    <w:p>
+      <w:pPr>
+        <w:spacing w:line="240" w:lineRule="auto"/>
+        <w:contextualSpacing/>
+        <w:rPr>
+          <w:sz w:val="24"/>
+          <w:szCs w:val="24"/>
+          <w:lang w:val="en-US"/>
+        </w:rPr>
+      </w:pPr>
+      <w:r>
+        <w:rPr>
+          <w:sz w:val="24"/>
+          <w:szCs w:val="24"/>
+          <w:lang w:val="en-US"/>
+        </w:rPr>
+        <w:t>you put to your ear</w:t>
+      </w:r>
+    </w:p>
+    <w:p>
+      <w:pPr>
+        <w:spacing w:line="240" w:lineRule="auto"/>
+        <w:contextualSpacing/>
+        <w:rPr>
+          <w:sz w:val="24"/>
+          <w:szCs w:val="24"/>
+          <w:lang w:val="en-US"/>
+        </w:rPr>
+      </w:pPr>
+      <w:r>
+        <w:rPr>
+          <w:sz w:val="24"/>
+          <w:szCs w:val="24"/>
+          <w:lang w:val="en-US"/>
+        </w:rPr>
+        <w:t>pretending to listen to</w:t>
+      </w:r>
+    </w:p>
+    <w:p>
+      <w:pPr>
+        <w:spacing w:line="240" w:lineRule="auto"/>
+        <w:contextualSpacing/>
+        <w:rPr>
+          <w:sz w:val="24"/>
+          <w:szCs w:val="24"/>
+          <w:lang w:val="en-US"/>
+        </w:rPr>
+      </w:pPr>
+      <w:r>
+        <w:rPr>
+          <w:sz w:val="24"/>
+          <w:szCs w:val="24"/>
+          <w:lang w:val="en-US"/>
+        </w:rPr>
+        <w:t>the sea the storm the future</w:t>
+      </w:r>
+    </w:p>
+    <w:p>
+      <w:pPr>
+        <w:spacing w:line="240" w:lineRule="auto"/>
+        <w:contextualSpacing/>
+        <w:rPr>
+          <w:sz w:val="24"/>
+          <w:szCs w:val="24"/>
+          <w:lang w:val="en-US"/>
+        </w:rPr>
+      </w:pPr>
+      <w:r>
+        <w:rPr>
+          <w:sz w:val="24"/>
+          <w:szCs w:val="24"/>
+          <w:lang w:val="en-US"/>
+        </w:rPr>
+        <w:t>don’t give me that bullshit</w:t>
+      </w:r>
+    </w:p>
+    <w:p>
+      <w:pPr>
+        <w:spacing w:line="240" w:lineRule="auto"/>
+        <w:contextualSpacing/>
+        <w:rPr>
+          <w:sz w:val="24"/>
+          <w:szCs w:val="24"/>
+          <w:lang w:val="en-US"/>
+        </w:rPr>
+      </w:pPr>
+      <w:r>
+        <w:rPr>
+          <w:sz w:val="24"/>
+          <w:szCs w:val="24"/>
+          <w:lang w:val="en-US"/>
+        </w:rPr>
+        <w:t xml:space="preserve">you’re a </w:t>
+      </w:r>
+      <w:r>
+        <w:rPr>
+          <w:sz w:val="24"/>
+          <w:szCs w:val="24"/>
+        </w:rPr>
+        <w:t xml:space="preserve">junkie </w:t>
+      </w:r>
+      <w:r>
+        <w:rPr>
+          <w:sz w:val="24"/>
+          <w:szCs w:val="24"/>
+          <w:lang w:val="en-US"/>
+        </w:rPr>
+        <w:t>who</w:t>
+      </w:r>
+      <w:r>
+        <w:rPr>
+          <w:sz w:val="24"/>
+          <w:szCs w:val="24"/>
+          <w:lang w:val="en-US"/>
+        </w:rPr>
+        <w:t>’</w:t>
+      </w:r>
+      <w:r>
+        <w:rPr>
+          <w:sz w:val="24"/>
+          <w:szCs w:val="24"/>
+          <w:lang w:val="en-US"/>
+        </w:rPr>
+        <w:t xml:space="preserve">s getting </w:t>
+      </w:r>
+      <w:r>
+        <w:rPr>
+          <w:sz w:val="24"/>
+          <w:szCs w:val="24"/>
+          <w:lang w:val="en-US"/>
+        </w:rPr>
+        <w:t>off</w:t>
+      </w:r>
+    </w:p>
+    <w:p>
+      <w:pPr>
+        <w:spacing w:line="240" w:lineRule="auto"/>
+        <w:contextualSpacing/>
+        <w:rPr>
+          <w:sz w:val="24"/>
+          <w:szCs w:val="24"/>
+          <w:lang w:val="en-US"/>
+        </w:rPr>
+      </w:pPr>
+      <w:r>
+        <w:rPr>
+          <w:sz w:val="24"/>
+          <w:szCs w:val="24"/>
+          <w:lang w:val="en-US"/>
+        </w:rPr>
+        <w:t>smack</w:t>
+      </w:r>
+      <w:r>
+        <w:rPr>
+          <w:sz w:val="24"/>
+          <w:szCs w:val="24"/>
+          <w:lang w:val="en-US"/>
+        </w:rPr>
+        <w:t xml:space="preserve"> </w:t>
+      </w:r>
+      <w:r>
+        <w:rPr>
+          <w:sz w:val="24"/>
+          <w:szCs w:val="24"/>
+          <w:lang w:val="en-US"/>
+        </w:rPr>
+        <w:t xml:space="preserve">his whole life </w:t>
+      </w:r>
+      <w:r>
+        <w:rPr>
+          <w:sz w:val="24"/>
+          <w:szCs w:val="24"/>
+          <w:lang w:val="en-US"/>
+        </w:rPr>
+        <w:t>starting tomorrow</w:t>
+      </w:r>
+    </w:p>
+    <w:p>
+      <w:pPr>
+        <w:spacing w:line="240" w:lineRule="auto"/>
+        <w:contextualSpacing/>
+        <w:rPr>
+          <w:sz w:val="24"/>
+          <w:szCs w:val="24"/>
+          <w:lang w:val="en-US"/>
+        </w:rPr>
+      </w:pPr>
+      <w:r>
+        <w:rPr>
+          <w:sz w:val="24"/>
+          <w:szCs w:val="24"/>
+          <w:lang w:val="en-US"/>
+        </w:rPr>
+        <w:t xml:space="preserve">but </w:t>
+      </w:r>
+      <w:r>
+        <w:rPr>
+          <w:sz w:val="24"/>
+          <w:szCs w:val="24"/>
+          <w:lang w:val="en-US"/>
+        </w:rPr>
+        <w:t xml:space="preserve">the </w:t>
+      </w:r>
+      <w:r>
+        <w:rPr>
+          <w:sz w:val="24"/>
+          <w:szCs w:val="24"/>
+          <w:lang w:val="en-US"/>
+        </w:rPr>
+        <w:t>first chance</w:t>
+      </w:r>
+      <w:r>
+        <w:rPr>
+          <w:sz w:val="24"/>
+          <w:szCs w:val="24"/>
+          <w:lang w:val="en-US"/>
+        </w:rPr>
+        <w:t xml:space="preserve"> he gets</w:t>
+      </w:r>
+    </w:p>
+    <w:p>
+      <w:pPr>
+        <w:spacing w:line="240" w:lineRule="auto"/>
+        <w:contextualSpacing/>
+        <w:rPr>
+          <w:sz w:val="24"/>
+          <w:szCs w:val="24"/>
+          <w:lang w:val="en-US"/>
+        </w:rPr>
+      </w:pPr>
+      <w:r>
+        <w:rPr>
+          <w:sz w:val="24"/>
+          <w:szCs w:val="24"/>
+          <w:lang w:val="en-US"/>
+        </w:rPr>
+        <w:t>he</w:t>
+      </w:r>
+      <w:r>
+        <w:rPr>
+          <w:sz w:val="24"/>
+          <w:szCs w:val="24"/>
+          <w:lang w:val="en-US"/>
+        </w:rPr>
+        <w:t xml:space="preserve"> steals grandma’s </w:t>
+      </w:r>
+      <w:r>
+        <w:rPr>
+          <w:sz w:val="24"/>
+          <w:szCs w:val="24"/>
+          <w:lang w:val="en-US"/>
+        </w:rPr>
+        <w:t>pension</w:t>
+      </w:r>
+    </w:p>
+    <w:p>
+      <w:pPr>
+        <w:spacing w:line="240" w:lineRule="auto"/>
+        <w:contextualSpacing/>
+        <w:rPr>
+          <w:sz w:val="24"/>
+          <w:szCs w:val="24"/>
+          <w:lang w:val="en-US"/>
+        </w:rPr>
+      </w:pPr>
+      <w:r>
+        <w:rPr>
+          <w:sz w:val="24"/>
+          <w:szCs w:val="24"/>
+          <w:lang w:val="en-US"/>
+        </w:rPr>
+        <w:t>and chases dragons in</w:t>
+      </w:r>
+      <w:r>
+        <w:rPr>
+          <w:sz w:val="24"/>
+          <w:szCs w:val="24"/>
+          <w:lang w:val="en-US"/>
+        </w:rPr>
+        <w:t xml:space="preserve"> a</w:t>
+      </w:r>
+      <w:r>
+        <w:rPr>
+          <w:sz w:val="24"/>
+          <w:szCs w:val="24"/>
+          <w:lang w:val="en-US"/>
+        </w:rPr>
+        <w:t xml:space="preserve"> </w:t>
+      </w:r>
+      <w:r>
+        <w:rPr>
+          <w:sz w:val="24"/>
+          <w:szCs w:val="24"/>
+          <w:lang w:val="en-US"/>
+        </w:rPr>
+        <w:t>chemical toilet</w:t>
+      </w:r>
+    </w:p>
+    <w:p>
+      <w:pPr>
+        <w:spacing w:line="240" w:lineRule="auto"/>
+        <w:contextualSpacing/>
+        <w:rPr>
+          <w:sz w:val="24"/>
+          <w:szCs w:val="24"/>
+          <w:lang w:val="en-US"/>
+        </w:rPr>
+      </w:pPr>
+      <w:r>
+        <w:rPr>
+          <w:sz w:val="24"/>
+          <w:szCs w:val="24"/>
+          <w:lang w:val="en-US"/>
+        </w:rPr>
+        <w:t xml:space="preserve">my </w:t>
+      </w:r>
+      <w:r>
+        <w:rPr>
+          <w:sz w:val="24"/>
+          <w:szCs w:val="24"/>
+          <w:lang w:val="en-US"/>
+        </w:rPr>
+        <w:t>town</w:t>
       </w:r>
     </w:p>
     <w:p>
@@ -1832,42 +2466,7 @@
           <w:szCs w:val="24"/>
           <w:lang w:val="en-US"/>
         </w:rPr>
-        <w:t>limp</w:t>
-      </w:r>
-      <w:r>
-        <w:rPr>
-          <w:sz w:val="24"/>
-          <w:szCs w:val="24"/>
-          <w:lang w:val="en-US"/>
-        </w:rPr>
-        <w:t xml:space="preserve"> dick</w:t>
-      </w:r>
-    </w:p>
-    <w:p>
-      <w:pPr>
-        <w:spacing w:line="240" w:lineRule="auto"/>
-        <w:contextualSpacing/>
-        <w:rPr>
-          <w:sz w:val="24"/>
-          <w:szCs w:val="24"/>
-          <w:lang w:val="en-US"/>
-        </w:rPr>
-      </w:pPr>
-      <w:r>
-        <w:rPr>
-          <w:sz w:val="24"/>
-          <w:szCs w:val="24"/>
-          <w:lang w:val="en-US"/>
-        </w:rPr>
-        <w:t>you frustrate me</w:t>
-      </w:r>
-      <w:r>
-        <w:rPr>
-          <w:sz w:val="24"/>
-          <w:szCs w:val="24"/>
-          <w:lang w:val="en-US"/>
-        </w:rPr>
-        <w:t xml:space="preserve"> you</w:t>
+        <w:t>hypocritical</w:t>
       </w:r>
       <w:r>
         <w:rPr>
@@ -1883,585 +2482,6 @@
           <w:szCs w:val="24"/>
           <w:lang w:val="en-US"/>
         </w:rPr>
-        <w:t>drive me crazy</w:t>
-      </w:r>
-    </w:p>
-    <w:p>
-      <w:pPr>
-        <w:spacing w:line="240" w:lineRule="auto"/>
-        <w:contextualSpacing/>
-        <w:rPr>
-          <w:sz w:val="24"/>
-          <w:szCs w:val="24"/>
-          <w:lang w:val="en-US"/>
-        </w:rPr>
-      </w:pPr>
-      <w:r>
-        <w:rPr>
-          <w:sz w:val="24"/>
-          <w:szCs w:val="24"/>
-          <w:lang w:val="en-US"/>
-        </w:rPr>
-        <w:t>I want to give you everything</w:t>
-      </w:r>
-    </w:p>
-    <w:p>
-      <w:pPr>
-        <w:spacing w:line="240" w:lineRule="auto"/>
-        <w:contextualSpacing/>
-        <w:rPr>
-          <w:sz w:val="24"/>
-          <w:szCs w:val="24"/>
-          <w:lang w:val="en-US"/>
-        </w:rPr>
-      </w:pPr>
-      <w:r>
-        <w:rPr>
-          <w:sz w:val="24"/>
-          <w:szCs w:val="24"/>
-          <w:lang w:val="en-US"/>
-        </w:rPr>
-        <w:t>and you</w:t>
-      </w:r>
-      <w:r>
-        <w:rPr>
-          <w:sz w:val="24"/>
-          <w:szCs w:val="24"/>
-          <w:lang w:val="en-US"/>
-        </w:rPr>
-        <w:t>’re just sitting there</w:t>
-      </w:r>
-    </w:p>
-    <w:p>
-      <w:pPr>
-        <w:spacing w:line="240" w:lineRule="auto"/>
-        <w:contextualSpacing/>
-        <w:rPr>
-          <w:sz w:val="24"/>
-          <w:szCs w:val="24"/>
-          <w:lang w:val="en-US"/>
-        </w:rPr>
-      </w:pPr>
-      <w:r>
-        <w:rPr>
-          <w:sz w:val="24"/>
-          <w:szCs w:val="24"/>
-          <w:lang w:val="en-US"/>
-        </w:rPr>
-        <w:t>counting sheep</w:t>
-      </w:r>
-    </w:p>
-    <w:p>
-      <w:pPr>
-        <w:spacing w:line="240" w:lineRule="auto"/>
-        <w:contextualSpacing/>
-        <w:rPr>
-          <w:sz w:val="24"/>
-          <w:szCs w:val="24"/>
-          <w:lang w:val="en-US"/>
-        </w:rPr>
-      </w:pPr>
-      <w:r>
-        <w:rPr>
-          <w:sz w:val="24"/>
-          <w:szCs w:val="24"/>
-          <w:lang w:val="en-US"/>
-        </w:rPr>
-        <w:t>developing paraplegia</w:t>
-      </w:r>
-    </w:p>
-    <w:p>
-      <w:pPr>
-        <w:spacing w:line="240" w:lineRule="auto"/>
-        <w:contextualSpacing/>
-        <w:rPr>
-          <w:sz w:val="24"/>
-          <w:szCs w:val="24"/>
-          <w:lang w:val="en-US"/>
-        </w:rPr>
-      </w:pPr>
-      <w:r>
-        <w:rPr>
-          <w:sz w:val="24"/>
-          <w:szCs w:val="24"/>
-          <w:lang w:val="en-US"/>
-        </w:rPr>
-        <w:t>what am I to you</w:t>
-      </w:r>
-    </w:p>
-    <w:p>
-      <w:pPr>
-        <w:spacing w:line="240" w:lineRule="auto"/>
-        <w:contextualSpacing/>
-        <w:rPr>
-          <w:sz w:val="24"/>
-          <w:szCs w:val="24"/>
-          <w:lang w:val="en-US"/>
-        </w:rPr>
-      </w:pPr>
-      <w:r>
-        <w:rPr>
-          <w:sz w:val="24"/>
-          <w:szCs w:val="24"/>
-          <w:lang w:val="en-US"/>
-        </w:rPr>
-        <w:t xml:space="preserve">some </w:t>
-      </w:r>
-      <w:r>
-        <w:rPr>
-          <w:sz w:val="24"/>
-          <w:szCs w:val="24"/>
-          <w:lang w:val="en-US"/>
-        </w:rPr>
-        <w:t>diploma</w:t>
-      </w:r>
-      <w:r>
-        <w:rPr>
-          <w:sz w:val="24"/>
-          <w:szCs w:val="24"/>
-          <w:lang w:val="en-US"/>
-        </w:rPr>
-        <w:t xml:space="preserve"> to </w:t>
-      </w:r>
-      <w:r>
-        <w:rPr>
-          <w:sz w:val="24"/>
-          <w:szCs w:val="24"/>
-          <w:lang w:val="en-US"/>
-        </w:rPr>
-        <w:t>put o</w:t>
-      </w:r>
-      <w:r>
-        <w:rPr>
-          <w:sz w:val="24"/>
-          <w:szCs w:val="24"/>
-          <w:lang w:val="en-US"/>
-        </w:rPr>
-        <w:t>ut for the guests</w:t>
-      </w:r>
-    </w:p>
-    <w:p>
-      <w:pPr>
-        <w:spacing w:line="240" w:lineRule="auto"/>
-        <w:contextualSpacing/>
-        <w:rPr>
-          <w:sz w:val="24"/>
-          <w:szCs w:val="24"/>
-          <w:lang w:val="en-US"/>
-        </w:rPr>
-      </w:pPr>
-      <w:r>
-        <w:rPr>
-          <w:sz w:val="24"/>
-          <w:szCs w:val="24"/>
-          <w:lang w:val="en-US"/>
-        </w:rPr>
-        <w:t xml:space="preserve">a souvenir a </w:t>
-      </w:r>
-      <w:r>
-        <w:rPr>
-          <w:sz w:val="24"/>
-          <w:szCs w:val="24"/>
-          <w:lang w:val="en-US"/>
-        </w:rPr>
-        <w:t>sea</w:t>
-      </w:r>
-      <w:r>
-        <w:rPr>
-          <w:sz w:val="24"/>
-          <w:szCs w:val="24"/>
-          <w:lang w:val="en-US"/>
-        </w:rPr>
-        <w:t xml:space="preserve">shell from </w:t>
-      </w:r>
-      <w:proofErr w:type="spellStart"/>
-      <w:r>
-        <w:rPr>
-          <w:sz w:val="24"/>
-          <w:szCs w:val="24"/>
-          <w:lang w:val="en-US"/>
-        </w:rPr>
-        <w:t>Sutomore</w:t>
-      </w:r>
-      <w:proofErr w:type="spellEnd"/>
-    </w:p>
-    <w:p>
-      <w:pPr>
-        <w:spacing w:line="240" w:lineRule="auto"/>
-        <w:contextualSpacing/>
-        <w:rPr>
-          <w:sz w:val="24"/>
-          <w:szCs w:val="24"/>
-          <w:lang w:val="en-US"/>
-        </w:rPr>
-      </w:pPr>
-      <w:r>
-        <w:rPr>
-          <w:sz w:val="24"/>
-          <w:szCs w:val="24"/>
-          <w:lang w:val="en-US"/>
-        </w:rPr>
-        <w:t xml:space="preserve">that </w:t>
-      </w:r>
-      <w:r>
-        <w:rPr>
-          <w:sz w:val="24"/>
-          <w:szCs w:val="24"/>
-          <w:lang w:val="en-US"/>
-        </w:rPr>
-        <w:t>every couple of years</w:t>
-      </w:r>
-    </w:p>
-    <w:p>
-      <w:pPr>
-        <w:spacing w:line="240" w:lineRule="auto"/>
-        <w:contextualSpacing/>
-        <w:rPr>
-          <w:sz w:val="24"/>
-          <w:szCs w:val="24"/>
-          <w:lang w:val="en-US"/>
-        </w:rPr>
-      </w:pPr>
-      <w:r>
-        <w:rPr>
-          <w:sz w:val="24"/>
-          <w:szCs w:val="24"/>
-          <w:lang w:val="en-US"/>
-        </w:rPr>
-        <w:t>you put to your ear</w:t>
-      </w:r>
-    </w:p>
-    <w:p>
-      <w:pPr>
-        <w:spacing w:line="240" w:lineRule="auto"/>
-        <w:contextualSpacing/>
-        <w:rPr>
-          <w:sz w:val="24"/>
-          <w:szCs w:val="24"/>
-          <w:lang w:val="en-US"/>
-        </w:rPr>
-      </w:pPr>
-      <w:r>
-        <w:rPr>
-          <w:sz w:val="24"/>
-          <w:szCs w:val="24"/>
-          <w:lang w:val="en-US"/>
-        </w:rPr>
-        <w:t>pretending to listen to</w:t>
-      </w:r>
-    </w:p>
-    <w:p>
-      <w:pPr>
-        <w:spacing w:line="240" w:lineRule="auto"/>
-        <w:contextualSpacing/>
-        <w:rPr>
-          <w:sz w:val="24"/>
-          <w:szCs w:val="24"/>
-          <w:lang w:val="en-US"/>
-        </w:rPr>
-      </w:pPr>
-      <w:r>
-        <w:rPr>
-          <w:sz w:val="24"/>
-          <w:szCs w:val="24"/>
-          <w:lang w:val="en-US"/>
-        </w:rPr>
-        <w:t>the sea the storm the future</w:t>
-      </w:r>
-    </w:p>
-    <w:p>
-      <w:pPr>
-        <w:spacing w:line="240" w:lineRule="auto"/>
-        <w:contextualSpacing/>
-        <w:rPr>
-          <w:sz w:val="24"/>
-          <w:szCs w:val="24"/>
-          <w:lang w:val="en-US"/>
-        </w:rPr>
-      </w:pPr>
-      <w:r>
-        <w:rPr>
-          <w:sz w:val="24"/>
-          <w:szCs w:val="24"/>
-          <w:lang w:val="en-US"/>
-        </w:rPr>
-        <w:t>don’t give me that bullshit</w:t>
-      </w:r>
-    </w:p>
-    <w:p>
-      <w:pPr>
-        <w:spacing w:line="240" w:lineRule="auto"/>
-        <w:contextualSpacing/>
-        <w:rPr>
-          <w:sz w:val="24"/>
-          <w:szCs w:val="24"/>
-          <w:lang w:val="en-US"/>
-        </w:rPr>
-      </w:pPr>
-      <w:r>
-        <w:rPr>
-          <w:sz w:val="24"/>
-          <w:szCs w:val="24"/>
-          <w:lang w:val="en-US"/>
-        </w:rPr>
-        <w:t>you’re a junky who</w:t>
-      </w:r>
-      <w:r>
-        <w:rPr>
-          <w:sz w:val="24"/>
-          <w:szCs w:val="24"/>
-          <w:lang w:val="en-US"/>
-        </w:rPr>
-        <w:t>’</w:t>
-      </w:r>
-      <w:r>
-        <w:rPr>
-          <w:sz w:val="24"/>
-          <w:szCs w:val="24"/>
-          <w:lang w:val="en-US"/>
-        </w:rPr>
-        <w:t xml:space="preserve">s getting </w:t>
-      </w:r>
-      <w:r>
-        <w:rPr>
-          <w:sz w:val="24"/>
-          <w:szCs w:val="24"/>
-          <w:lang w:val="en-US"/>
-        </w:rPr>
-        <w:t>off</w:t>
-      </w:r>
-    </w:p>
-    <w:p>
-      <w:pPr>
-        <w:spacing w:line="240" w:lineRule="auto"/>
-        <w:contextualSpacing/>
-        <w:rPr>
-          <w:sz w:val="24"/>
-          <w:szCs w:val="24"/>
-          <w:lang w:val="en-US"/>
-        </w:rPr>
-      </w:pPr>
-      <w:r>
-        <w:rPr>
-          <w:sz w:val="24"/>
-          <w:szCs w:val="24"/>
-          <w:lang w:val="en-US"/>
-        </w:rPr>
-        <w:t>smack</w:t>
-      </w:r>
-      <w:r>
-        <w:rPr>
-          <w:sz w:val="24"/>
-          <w:szCs w:val="24"/>
-          <w:lang w:val="en-US"/>
-        </w:rPr>
-        <w:t xml:space="preserve"> </w:t>
-      </w:r>
-      <w:r>
-        <w:rPr>
-          <w:sz w:val="24"/>
-          <w:szCs w:val="24"/>
-          <w:lang w:val="en-US"/>
-        </w:rPr>
-        <w:t xml:space="preserve">his whole life </w:t>
-      </w:r>
-      <w:r>
-        <w:rPr>
-          <w:sz w:val="24"/>
-          <w:szCs w:val="24"/>
-          <w:lang w:val="en-US"/>
-        </w:rPr>
-        <w:t>starting tomorrow</w:t>
-      </w:r>
-    </w:p>
-    <w:p>
-      <w:pPr>
-        <w:spacing w:line="240" w:lineRule="auto"/>
-        <w:contextualSpacing/>
-        <w:rPr>
-          <w:sz w:val="24"/>
-          <w:szCs w:val="24"/>
-          <w:lang w:val="en-US"/>
-        </w:rPr>
-      </w:pPr>
-      <w:r>
-        <w:rPr>
-          <w:sz w:val="24"/>
-          <w:szCs w:val="24"/>
-          <w:lang w:val="en-US"/>
-        </w:rPr>
-        <w:t xml:space="preserve">but </w:t>
-      </w:r>
-      <w:r>
-        <w:rPr>
-          <w:sz w:val="24"/>
-          <w:szCs w:val="24"/>
-          <w:lang w:val="en-US"/>
-        </w:rPr>
-        <w:t xml:space="preserve">the </w:t>
-      </w:r>
-      <w:r>
-        <w:rPr>
-          <w:sz w:val="24"/>
-          <w:szCs w:val="24"/>
-          <w:lang w:val="en-US"/>
-        </w:rPr>
-        <w:t>first chance</w:t>
-      </w:r>
-      <w:r>
-        <w:rPr>
-          <w:sz w:val="24"/>
-          <w:szCs w:val="24"/>
-          <w:lang w:val="en-US"/>
-        </w:rPr>
-        <w:t xml:space="preserve"> he gets</w:t>
-      </w:r>
-    </w:p>
-    <w:p>
-      <w:pPr>
-        <w:spacing w:line="240" w:lineRule="auto"/>
-        <w:contextualSpacing/>
-        <w:rPr>
-          <w:sz w:val="24"/>
-          <w:szCs w:val="24"/>
-          <w:lang w:val="en-US"/>
-        </w:rPr>
-      </w:pPr>
-      <w:r>
-        <w:rPr>
-          <w:sz w:val="24"/>
-          <w:szCs w:val="24"/>
-          <w:lang w:val="en-US"/>
-        </w:rPr>
-        <w:t>he</w:t>
-      </w:r>
-      <w:r>
-        <w:rPr>
-          <w:sz w:val="24"/>
-          <w:szCs w:val="24"/>
-          <w:lang w:val="en-US"/>
-        </w:rPr>
-        <w:t xml:space="preserve"> steals grandma’s </w:t>
-      </w:r>
-      <w:r>
-        <w:rPr>
-          <w:sz w:val="24"/>
-          <w:szCs w:val="24"/>
-          <w:lang w:val="en-US"/>
-        </w:rPr>
-        <w:t>pension</w:t>
-      </w:r>
-    </w:p>
-    <w:p>
-      <w:pPr>
-        <w:spacing w:line="240" w:lineRule="auto"/>
-        <w:contextualSpacing/>
-        <w:rPr>
-          <w:sz w:val="24"/>
-          <w:szCs w:val="24"/>
-          <w:lang w:val="en-US"/>
-        </w:rPr>
-      </w:pPr>
-      <w:r>
-        <w:rPr>
-          <w:sz w:val="24"/>
-          <w:szCs w:val="24"/>
-          <w:lang w:val="en-US"/>
-        </w:rPr>
-        <w:t>and chases dragons in</w:t>
-      </w:r>
-      <w:r>
-        <w:rPr>
-          <w:sz w:val="24"/>
-          <w:szCs w:val="24"/>
-          <w:lang w:val="en-US"/>
-        </w:rPr>
-        <w:t xml:space="preserve"> a</w:t>
-      </w:r>
-      <w:r>
-        <w:rPr>
-          <w:sz w:val="24"/>
-          <w:szCs w:val="24"/>
-          <w:lang w:val="en-US"/>
-        </w:rPr>
-        <w:t xml:space="preserve"> </w:t>
-      </w:r>
-      <w:r>
-        <w:rPr>
-          <w:sz w:val="24"/>
-          <w:szCs w:val="24"/>
-          <w:lang w:val="en-US"/>
-        </w:rPr>
-        <w:t>chemical toilet</w:t>
-      </w:r>
-    </w:p>
-    <w:p>
-      <w:pPr>
-        <w:spacing w:line="240" w:lineRule="auto"/>
-        <w:contextualSpacing/>
-        <w:rPr>
-          <w:sz w:val="24"/>
-          <w:szCs w:val="24"/>
-          <w:lang w:val="en-US"/>
-        </w:rPr>
-      </w:pPr>
-      <w:r>
-        <w:rPr>
-          <w:sz w:val="24"/>
-          <w:szCs w:val="24"/>
-          <w:lang w:val="en-US"/>
-        </w:rPr>
-        <w:t xml:space="preserve">my </w:t>
-      </w:r>
-      <w:r>
-        <w:rPr>
-          <w:sz w:val="24"/>
-          <w:szCs w:val="24"/>
-          <w:lang w:val="en-US"/>
-        </w:rPr>
-        <w:t>town</w:t>
-      </w:r>
-    </w:p>
-    <w:p>
-      <w:pPr>
-        <w:spacing w:line="240" w:lineRule="auto"/>
-        <w:contextualSpacing/>
-        <w:rPr>
-          <w:sz w:val="24"/>
-          <w:szCs w:val="24"/>
-          <w:lang w:val="en-US"/>
-        </w:rPr>
-      </w:pPr>
-      <w:r>
-        <w:rPr>
-          <w:sz w:val="24"/>
-          <w:szCs w:val="24"/>
-          <w:lang w:val="en-US"/>
-        </w:rPr>
-        <w:t xml:space="preserve">you </w:t>
-      </w:r>
-      <w:r>
-        <w:rPr>
-          <w:sz w:val="24"/>
-          <w:szCs w:val="24"/>
-          <w:lang w:val="en-US"/>
-        </w:rPr>
-        <w:t>hypocritical</w:t>
-      </w:r>
-      <w:r>
-        <w:rPr>
-          <w:sz w:val="24"/>
-          <w:szCs w:val="24"/>
-          <w:lang w:val="en-US"/>
-        </w:rPr>
-        <w:t xml:space="preserve"> </w:t>
-      </w:r>
-      <w:r>
-        <w:rPr>
-          <w:sz w:val="24"/>
-          <w:szCs w:val="24"/>
-          <w:lang w:val="en-US"/>
-        </w:rPr>
         <w:t>schizophrenic shit</w:t>
       </w:r>
     </w:p>
@@ -2482,37 +2502,6 @@
           <w:lang w:val="en-US"/>
         </w:rPr>
         <w:t>I wouldn’t trade you for the world.</w:t>
-      </w:r>
-    </w:p>
-    <w:p>
-      <w:pPr>
-        <w:spacing w:line="240" w:lineRule="auto"/>
-        <w:contextualSpacing/>
-        <w:rPr>
-          <w:sz w:val="24"/>
-          <w:szCs w:val="24"/>
-          <w:lang w:val="en-US"/>
-        </w:rPr>
-      </w:pPr>
-    </w:p>
-    <w:p>
-      <w:pPr>
-        <w:spacing w:line="240" w:lineRule="auto"/>
-        <w:rPr>
-          <w:b/>
-          <w:bCs/>
-          <w:sz w:val="24"/>
-          <w:szCs w:val="24"/>
-        </w:rPr>
-      </w:pPr>
-      <w:r>
-        <w:rPr>
-          <w:b/>
-          <w:bCs/>
-          <w:sz w:val="24"/>
-          <w:szCs w:val="24"/>
-        </w:rPr>
-        <w:t>Vladana Perlić</w:t>
       </w:r>
     </w:p>
     <w:sectPr>
@@ -2526,7 +2515,7 @@
 </file>
 
 <file path=word/styles.xml><?xml version="1.0" encoding="utf-8"?>
-<w:styles xmlns:mc="http://schemas.openxmlformats.org/markup-compatibility/2006" xmlns:r="http://schemas.openxmlformats.org/officeDocument/2006/relationships" xmlns:w="http://schemas.openxmlformats.org/wordprocessingml/2006/main" xmlns:w14="http://schemas.microsoft.com/office/word/2010/wordml" xmlns:w15="http://schemas.microsoft.com/office/word/2012/wordml" xmlns:w16cex="http://schemas.microsoft.com/office/word/2018/wordml/cex" xmlns:w16cid="http://schemas.microsoft.com/office/word/2016/wordml/cid" xmlns:w16="http://schemas.microsoft.com/office/word/2018/wordml" xmlns:w16du="http://schemas.microsoft.com/office/word/2023/wordml/word16du" xmlns:w16sdtdh="http://schemas.microsoft.com/office/word/2020/wordml/sdtdatahash" xmlns:w16se="http://schemas.microsoft.com/office/word/2015/wordml/symex" mc:Ignorable="w14 w15 w16se w16cid w16 w16cex w16sdtdh w16du">
+<w:styles xmlns:mc="http://schemas.openxmlformats.org/markup-compatibility/2006" xmlns:r="http://schemas.openxmlformats.org/officeDocument/2006/relationships" xmlns:w="http://schemas.openxmlformats.org/wordprocessingml/2006/main" xmlns:w14="http://schemas.microsoft.com/office/word/2010/wordml" xmlns:w15="http://schemas.microsoft.com/office/word/2012/wordml" xmlns:w16cex="http://schemas.microsoft.com/office/word/2018/wordml/cex" xmlns:w16cid="http://schemas.microsoft.com/office/word/2016/wordml/cid" xmlns:w16="http://schemas.microsoft.com/office/word/2018/wordml" xmlns:w16du="http://schemas.microsoft.com/office/word/2023/wordml/word16du" xmlns:w16sdtdh="http://schemas.microsoft.com/office/word/2020/wordml/sdtdatahash" xmlns:w16sdtfl="http://schemas.microsoft.com/office/word/2024/wordml/sdtformatlock" xmlns:w16se="http://schemas.microsoft.com/office/word/2015/wordml/symex" mc:Ignorable="w14 w15 w16se w16cid w16 w16cex w16sdtdh w16sdtfl w16du">
   <w:docDefaults>
     <w:rPrDefault>
       <w:rPr>
@@ -2955,7 +2944,6 @@
   <w:style w:type="character" w:default="1" w:styleId="DefaultParagraphFont">
     <w:name w:val="Default Paragraph Font"/>
     <w:uiPriority w:val="1"/>
-    <w:semiHidden/>
     <w:unhideWhenUsed/>
   </w:style>
   <w:style w:type="table" w:default="1" w:styleId="TableNormal">
@@ -3280,4 +3268,10 @@
     <ds:schemaRef ds:uri="http://schemas.openxmlformats.org/officeDocument/2006/bibliography"/>
   </ds:schemaRefs>
 </ds:datastoreItem>
+</file>
+
+<file path=docMetadata/LabelInfo.xml><?xml version="1.0" encoding="utf-8"?>
+<clbl:labelList xmlns:clbl="http://schemas.microsoft.com/office/2020/mipLabelMetadata">
+  <clbl:label id="{cf8c7287-838c-46dd-b281-b1140229e67a}" enabled="1" method="Privileged" siteId="{75e027c9-20d5-47d5-b82f-77d7cd041e8f}" contentBits="0" removed="0"/>
+</clbl:labelList>
 </file>
</xml_diff>